<commit_message>
fixed view id and add logger
</commit_message>
<xml_diff>
--- a/test/Parser/Resources/normalizer_test_document_lck.docx
+++ b/test/Parser/Resources/normalizer_test_document_lck.docx
@@ -125,7 +125,49 @@
           <w:color w:val="FF0000"/>
           <w:sz w:val="32"/>
         </w:rPr>
-        <w:t>$“ als Formatierung für das restliche Feld übernommen! Es dürfen durchaus auch gerne mal ein paar mehr Felder kommen:</w:t>
+        <w:t>$</w:t>
+      </w:r>
+      <w:r>
+        <w:rPr>
+          <w:rFonts w:ascii="Trebuchet MS" w:hAnsi="Trebuchet MS"/>
+        </w:rPr>
+        <w:t>“</w:t>
+      </w:r>
+      <w:r>
+        <w:rPr>
+          <w:rFonts w:ascii="Trebuchet MS" w:hAnsi="Trebuchet MS"/>
+          <w:b/>
+          <w:color w:val="FF0000"/>
+          <w:sz w:val="32"/>
+        </w:rPr>
+        <w:t xml:space="preserve"> </w:t>
+      </w:r>
+      <w:r>
+        <w:rPr>
+          <w:rFonts w:ascii="Trebuchet MS" w:hAnsi="Trebuchet MS"/>
+        </w:rPr>
+        <w:t>als Formatierung für das restliche Feld übernommen!</w:t>
+      </w:r>
+      <w:r>
+        <w:rPr>
+          <w:rFonts w:ascii="Trebuchet MS" w:hAnsi="Trebuchet MS"/>
+        </w:rPr>
+        <w:t xml:space="preserve"> </w:t>
+      </w:r>
+    </w:p>
+    <w:p>
+      <w:pPr>
+        <w:spacing w:after="0"/>
+        <w:jc w:val="both"/>
+        <w:rPr>
+          <w:rFonts w:ascii="Trebuchet MS" w:hAnsi="Trebuchet MS"/>
+        </w:rPr>
+      </w:pPr>
+      <w:r>
+        <w:rPr>
+          <w:rFonts w:ascii="Trebuchet MS" w:hAnsi="Trebuchet MS"/>
+        </w:rPr>
+        <w:t>Es dürfen durchaus auch gerne mal ein paar mehr Felder kommen:</w:t>
       </w:r>
     </w:p>
     <w:p>
@@ -458,7 +500,26 @@
         <w:rPr>
           <w:rFonts w:ascii="Arial" w:hAnsi="Arial" w:cs="Arial"/>
         </w:rPr>
-        <w:t>$C156 ${C:12}, dann werden diese von der Normalisierung ausgenommen, blieben aber trotzdem im Dokument erhalten. Darüber hinaus gibt sogenannten Blockfelder. Mit Hilfe dieser Felder können Text oder auch andere Felder entsprechende der Zeilen einer Ergebnismenge wiederholt werden. ${B:0}${F:156}${B:1}Mit einem Block „0“ wird der Beginn und mit „1“ entsprechend das Ende markiert. Das Feld mit der ID 156 befindet sich zwischen den beiden Blockelementen und wird entsprechende der Einträge einer Ergebnisse, welche das Feld 156 enthalten, wiederholt.Grundsätzlich müssen bei der Deklarierung von Blöcke auf folgendes geachtet werden:Positionen der Start- und Endmarkierung eines BlocksDer Start und das Ende eines Blockes müssen Geschwisterknoten sein. Befinden sich diese in unterschiedlichen Absätzen, so bezieht sich die Prüfung auf die Absätze. Schlägt die Prüfung fehl, dann werden diese Blockmarkierungen nicht weiter berücksichtigt.Eine Verschachtelung von Blöcken ist nicht möglich!Textblock: </w:t>
+        <w:t>$C156 ${C:12}, dann werden diese von der Normalisierung ausgenommen, blieben aber trotzdem im Dokument erhalte</w:t>
+      </w:r>
+      <w:r>
+        <w:rPr>
+          <w:rFonts w:ascii="Arial" w:hAnsi="Arial" w:cs="Arial"/>
+          <w:u w:val="single"/>
+        </w:rPr>
+        <w:t>n</w:t>
+      </w:r>
+      <w:r>
+        <w:rPr>
+          <w:rFonts w:ascii="Arial" w:hAnsi="Arial" w:cs="Arial"/>
+        </w:rPr>
+        <w:t>.</w:t>
+      </w:r>
+      <w:r>
+        <w:rPr>
+          <w:rFonts w:ascii="Arial" w:hAnsi="Arial" w:cs="Arial"/>
+        </w:rPr>
+        <w:t xml:space="preserve"> </w:t>
       </w:r>
     </w:p>
     <w:p>
@@ -473,18 +534,164 @@
         </w:rPr>
         <w:br w:type="page"/>
       </w:r>
-    </w:p>
-    <w:p>
-      <w:pPr>
-        <w:rPr>
-          <w:rFonts w:ascii="Arial" w:hAnsi="Arial" w:cs="Arial"/>
-        </w:rPr>
-      </w:pPr>
-      <w:r>
-        <w:rPr>
-          <w:rFonts w:ascii="Arial" w:hAnsi="Arial" w:cs="Arial"/>
-        </w:rPr>
-        <w:t>${B:0}${F:157}${B:1}</w:t>
+      <w:r>
+        <w:rPr>
+          <w:rFonts w:ascii="Arial" w:hAnsi="Arial" w:cs="Arial"/>
+        </w:rPr>
+        <w:lastRenderedPageBreak/>
+        <w:t xml:space="preserve">Darüber hinaus gibt sogenannten Blockfelder. Mit Hilfe dieser Felder können Text oder auch andere Felder entsprechende der Zeilen einer Ergebnismenge wiederholt werden. </w:t>
+      </w:r>
+    </w:p>
+    <w:p>
+      <w:pPr>
+        <w:rPr>
+          <w:rFonts w:ascii="Arial" w:hAnsi="Arial" w:cs="Arial"/>
+        </w:rPr>
+      </w:pPr>
+      <w:r>
+        <w:rPr>
+          <w:rFonts w:ascii="Arial" w:hAnsi="Arial" w:cs="Arial"/>
+        </w:rPr>
+        <w:t>${B:0}</w:t>
+      </w:r>
+    </w:p>
+    <w:p>
+      <w:pPr>
+        <w:ind w:firstLine="708"/>
+        <w:rPr>
+          <w:rFonts w:ascii="Arial" w:hAnsi="Arial" w:cs="Arial"/>
+        </w:rPr>
+      </w:pPr>
+      <w:r>
+        <w:rPr>
+          <w:rFonts w:ascii="Arial" w:hAnsi="Arial" w:cs="Arial"/>
+        </w:rPr>
+        <w:t>${F:156}</w:t>
+      </w:r>
+    </w:p>
+    <w:p>
+      <w:pPr>
+        <w:rPr>
+          <w:rFonts w:ascii="Arial" w:hAnsi="Arial" w:cs="Arial"/>
+        </w:rPr>
+      </w:pPr>
+      <w:r>
+        <w:rPr>
+          <w:rFonts w:ascii="Arial" w:hAnsi="Arial" w:cs="Arial"/>
+        </w:rPr>
+        <w:t>${B:1}</w:t>
+      </w:r>
+    </w:p>
+    <w:p>
+      <w:pPr>
+        <w:rPr>
+          <w:rFonts w:ascii="Arial" w:hAnsi="Arial" w:cs="Arial"/>
+        </w:rPr>
+      </w:pPr>
+      <w:r>
+        <w:rPr>
+          <w:rFonts w:ascii="Arial" w:hAnsi="Arial" w:cs="Arial"/>
+        </w:rPr>
+        <w:t xml:space="preserve">Mit einem Block „0“ wird der Beginn und mit „1“ entsprechend das Ende markiert. </w:t>
+      </w:r>
+      <w:r>
+        <w:rPr>
+          <w:rFonts w:ascii="Arial" w:hAnsi="Arial" w:cs="Arial"/>
+        </w:rPr>
+        <w:t>Das Feld mit der ID 156 befindet sich zwischen den beiden Blockelementen und wird entsprechende der Einträge einer Ergebnisse, welche das Feld 156 enthalten, wiederholt.</w:t>
+      </w:r>
+    </w:p>
+    <w:p>
+      <w:pPr>
+        <w:rPr>
+          <w:rFonts w:ascii="Arial" w:hAnsi="Arial" w:cs="Arial"/>
+          <w:b/>
+        </w:rPr>
+      </w:pPr>
+      <w:r>
+        <w:rPr>
+          <w:rFonts w:ascii="Arial" w:hAnsi="Arial" w:cs="Arial"/>
+          <w:b/>
+        </w:rPr>
+        <w:t>Grundsätzlich müssen bei der Deklarierung von Blöcke auf folgendes geachtet werden:</w:t>
+      </w:r>
+    </w:p>
+    <w:p>
+      <w:pPr>
+        <w:pStyle w:val="Listenabsatz"/>
+        <w:numPr>
+          <w:ilvl w:val="0"/>
+          <w:numId w:val="4"/>
+        </w:numPr>
+        <w:rPr>
+          <w:rFonts w:ascii="Arial" w:hAnsi="Arial" w:cs="Arial"/>
+        </w:rPr>
+      </w:pPr>
+      <w:r>
+        <w:rPr>
+          <w:rFonts w:ascii="Arial" w:hAnsi="Arial" w:cs="Arial"/>
+        </w:rPr>
+        <w:t>Positionen der Start- und Endmarkierung eines Blocks</w:t>
+      </w:r>
+    </w:p>
+    <w:p>
+      <w:pPr>
+        <w:rPr>
+          <w:rFonts w:ascii="Arial" w:hAnsi="Arial" w:cs="Arial"/>
+        </w:rPr>
+      </w:pPr>
+      <w:r>
+        <w:rPr>
+          <w:rFonts w:ascii="Arial" w:hAnsi="Arial" w:cs="Arial"/>
+        </w:rPr>
+        <w:t xml:space="preserve">Der Start und das Ende eines Blockes müssen Geschwisterknoten sein. Befinden sich diese in unterschiedlichen Absätzen, so bezieht sich die Prüfung auf die Absätze. </w:t>
+      </w:r>
+      <w:r>
+        <w:rPr>
+          <w:rFonts w:ascii="Arial" w:hAnsi="Arial" w:cs="Arial"/>
+        </w:rPr>
+        <w:t>Schlägt die Prüfung fehl, dann werden diese Blockmarkierungen nicht weiter berücksichtigt.</w:t>
+      </w:r>
+    </w:p>
+    <w:p>
+      <w:pPr>
+        <w:rPr>
+          <w:rFonts w:ascii="Arial" w:hAnsi="Arial" w:cs="Arial"/>
+        </w:rPr>
+      </w:pPr>
+      <w:r>
+        <w:rPr>
+          <w:rFonts w:ascii="Arial" w:hAnsi="Arial" w:cs="Arial"/>
+        </w:rPr>
+        <w:t>Eine Verschachtelung von Blöcken ist nicht möglich!</w:t>
+      </w:r>
+    </w:p>
+    <w:p>
+      <w:pPr>
+        <w:rPr>
+          <w:rFonts w:ascii="Arial" w:hAnsi="Arial" w:cs="Arial"/>
+          <w:b/>
+        </w:rPr>
+      </w:pPr>
+      <w:r>
+        <w:rPr>
+          <w:rFonts w:ascii="Arial" w:hAnsi="Arial" w:cs="Arial"/>
+          <w:b/>
+        </w:rPr>
+        <w:t>Textblock:</w:t>
+      </w:r>
+    </w:p>
+    <w:p>
+      <w:pPr>
+        <w:rPr>
+          <w:rFonts w:ascii="Arial" w:hAnsi="Arial" w:cs="Arial"/>
+        </w:rPr>
+      </w:pPr>
+      <w:r>
+        <w:rPr>
+          <w:rFonts w:ascii="Arial" w:hAnsi="Arial" w:cs="Arial"/>
+        </w:rPr>
+        <w:t>${B:0} ${F:157} ${B:1}</w:t>
       </w:r>
     </w:p>
     <w:p>

</xml_diff>